<commit_message>
Editorial pass on Chapters 3-5: remove em-dash-heavy phrasing
Chapters 3, 4, and 5 relied heavily on em-dashes for parenthetical/relative
clauses (over 230 instances combined), a stylistic pattern that reads as
machine-generated rather than natural academic Persian prose. Converted
these to standard Persian comma-based subordinate clauses throughout, while
leaving legitimate "—" table placeholders (used for N/A cells) untouched.
Verified all three chapters re-render with identical page counts and no
numeric or data changes -- this is a pure prose-style edit.

Co-Authored-By: Claude Sonnet 5 <noreply@anthropic.com>
Claude-Session: https://claude.ai/code/session_01Td7h9uNaGHAAYmqLFom5Ke
</commit_message>
<xml_diff>
--- a/docs/Chapter3_Proposed_Approach_and_Architecture.docx
+++ b/docs/Chapter3_Proposed_Approach_and_Architecture.docx
@@ -171,7 +171,7 @@
           <w:szCs w:val="26"/>
           <w:rtl/>
         </w:rPr>
-        <w:t xml:space="preserve"> است: هیچ فیچر، برچسب یا تصمیمی در هیچ نقطه از خط‌لوله مجاز نیست از اطلاعاتِ مربوط به لحظه‌ای پس از زمانِ تصمیم‌گیری استفاده کند. این اصل نه‌فقط یک ترجیحِ طراحی، بلکه پیش‌شرطِ اعتبارِ علمیِ هرگونه ادعای پیش‌بینی در حوزه‌ی سری‌های زمانیِ مالی است؛ نقضِ آن — حتی به‌طور ناخواسته و در یک خطِ کد — می‌تواند معیارهایی نظیرِ AUC را به‌طور مصنوعی و بدون هیچ مهارتِ واقعی بالا ببرد، پدیده‌ای که در ادبیاتِ یادگیریِ ماشین با عنوانِ نشتِ داده (Data Leakage) شناخته می‌شود. اصلِ دوم، </w:t>
+        <w:t xml:space="preserve"> است: هیچ فیچر، برچسب یا تصمیمی در هیچ نقطه از خط‌لوله مجاز نیست از اطلاعاتِ مربوط به لحظه‌ای پس از زمانِ تصمیم‌گیری استفاده کند. این اصل نه‌فقط یک ترجیحِ طراحی، بلکه پیش‌شرطِ اعتبارِ علمیِ هرگونه ادعای پیش‌بینی در حوزه‌ی سری‌های زمانیِ مالی است؛ نقضِ آن، حتی به‌طور ناخواسته و در یک خطِ کد، می‌تواند معیارهایی نظیرِ AUC را به‌طور مصنوعی و بدون هیچ مهارتِ واقعی بالا ببرد، پدیده‌ای که در ادبیاتِ یادگیریِ ماشین با عنوانِ نشتِ داده (Data Leakage) شناخته می‌شود. اصلِ دوم، </w:t>
       </w:r>
       <w:r>
         <w:rPr>
@@ -199,7 +199,7 @@
           <w:szCs w:val="26"/>
           <w:rtl/>
         </w:rPr>
-        <w:t xml:space="preserve"> است: هیچ ادعای عملکردی صرفاً بر پایه‌ی یک تفکیکِ ثابتِ آموزش/آزمون پذیرفته نمی‌شود، بلکه باید در برابرِ اعتبارسنجیِ غلتانِ زمانی (Walk-Forward) هم پایدار بماند — رویکردی که به‌طورِ خاص در برابرِ ماهیتِ غیرِایستا (Non-Stationary) بودنِ بازارهای مالی طراحی شده است. اصلِ سوم، </w:t>
+        <w:t xml:space="preserve"> است: هیچ ادعای عملکردی صرفاً بر پایه‌ی یک تفکیکِ ثابتِ آموزش/آزمون پذیرفته نمی‌شود، بلکه باید در برابرِ اعتبارسنجیِ غلتانِ زمانی (Walk-Forward) هم پایدار بماند، رویکردی که به‌طورِ خاص در برابرِ ماهیتِ غیرِایستا (Non-Stationary) بودنِ بازارهای مالی طراحی شده است. اصلِ سوم، </w:t>
       </w:r>
       <w:r>
         <w:rPr>
@@ -1549,7 +1549,7 @@
           <w:szCs w:val="26"/>
           <w:rtl/>
         </w:rPr>
-        <w:t xml:space="preserve">) فراتر رود را به‌عنوانِ رویدادِ شرکتی علامت‌گذاری می‌کند. آستانه‌ی ۲۵ درصد عمداً بسیار بالاتر از دامنه‌ی نوسانِ روزانه‌ی معمولِ بورسِ تهران (در حدودِ مثبت و منفیِ ۵ تا ۶ درصد) انتخاب شده تا نوساناتِ شدید ولی واقعیِ بازار (مانندِ روزهای بحرانی) دست‌نخورده باقی بمانند و تنها جهش‌هایی که به‌وضوح غیرِعادی‌اند تعدیل شوند. برای هر رویدادِ شناسایی‌شده، یک ضریبِ تعدیل محاسبه و به تمامِ قیمت‌های پیش از آن رویداد اعمال می‌شود — دقیقاً به همان شیوه‌ای که تعدیلِ افزایشِ سرمایه یا تقسیمِ سهام در بازارهای توسعه‌یافته انجام می‌شود. این محدودیتِ روش‌شناختی — که تشخیصِ رویداد صرفاً بر اساسِ بزرگیِ جهش است، نه اطلاعِ دقیقِ نوعِ رویداد — به‌صراحت به‌عنوانِ یکی از محدودیت‌های این پژوهش ثبت می‌شود.</w:t>
+        <w:t xml:space="preserve">) فراتر رود را به‌عنوانِ رویدادِ شرکتی علامت‌گذاری می‌کند. آستانه‌ی ۲۵ درصد عمداً بسیار بالاتر از دامنه‌ی نوسانِ روزانه‌ی معمولِ بورسِ تهران (در حدودِ مثبت و منفیِ ۵ تا ۶ درصد) انتخاب شده تا نوساناتِ شدید ولی واقعیِ بازار (مانندِ روزهای بحرانی) دست‌نخورده باقی بمانند و تنها جهش‌هایی که به‌وضوح غیرِعادی‌اند تعدیل شوند. برای هر رویدادِ شناسایی‌شده، یک ضریبِ تعدیل محاسبه و به تمامِ قیمت‌های پیش از آن رویداد اعمال می‌شود، دقیقاً به همان شیوه‌ای که تعدیلِ افزایشِ سرمایه یا تقسیمِ سهام در بازارهای توسعه‌یافته انجام می‌شود. این محدودیتِ روش‌شناختی، که تشخیصِ رویداد صرفاً بر اساسِ بزرگیِ جهش است، نه اطلاعِ دقیقِ نوعِ رویداد، به‌صراحت به‌عنوانِ یکی از محدودیت‌های این پژوهش ثبت می‌شود.</w:t>
       </w:r>
     </w:p>
     <w:p>
@@ -1570,7 +1570,7 @@
           <w:szCs w:val="26"/>
           <w:rtl/>
         </w:rPr>
-        <w:t xml:space="preserve">پس از تعدیلِ رویدادهای شرکتی، ردیف‌های دارایِ حجمِ معاملاتیِ صفر (روزهای بسته یا فاقدِ معامله) حذف می‌شوند و در صورتِ نیاز — یعنی برای نمادهایی با کمتر از ۵۰۰ ردیفِ معتبر پس از فیلتر — یک مرحله‌ی اختیاریِ افزایشِ داده مبتنی بر شبکه‌ی مولدِ تخاصمی (GAN) در نظر گرفته شده است؛ در عمل، تمامیِ شش نمادِ منتخب این آستانه را برآورده می‌کنند و نیازی به فعال‌سازیِ این مرحله نبوده است. تصمیمِ طراحیِ نگه‌داشتنِ این مسیرِ اختیاری — به‌جایِ حذفِ کاملِ آن — برای تضمینِ مقیاس‌پذیریِ سامانه به نمادهای کم‌سابقه‌تر در پژوهش‌های آینده صورت گرفته است.</w:t>
+        <w:t xml:space="preserve">پس از تعدیلِ رویدادهای شرکتی، ردیف‌های دارایِ حجمِ معاملاتیِ صفر (روزهای بسته یا فاقدِ معامله) حذف می‌شوند و در صورتِ نیاز، یعنی برای نمادهایی با کمتر از ۵۰۰ ردیفِ معتبر پس از فیلتر، یک مرحله‌ی اختیاریِ افزایشِ داده مبتنی بر شبکه‌ی مولدِ تخاصمی (GAN) در نظر گرفته شده است؛ در عمل، تمامیِ شش نمادِ منتخب این آستانه را برآورده می‌کنند و نیازی به فعال‌سازیِ این مرحله نبوده است. تصمیمِ طراحیِ نگه‌داشتنِ این مسیرِ اختیاری، به‌جایِ حذفِ کاملِ آن، برای تضمینِ مقیاس‌پذیریِ سامانه به نمادهای کم‌سابقه‌تر در پژوهش‌های آینده صورت گرفته است.</w:t>
       </w:r>
     </w:p>
     <w:p>
@@ -1614,7 +1614,7 @@
           <w:szCs w:val="26"/>
           <w:rtl/>
         </w:rPr>
-        <w:t xml:space="preserve">برایِ هر نماد، صد فیچرِ عددیِ روزانه از چهار خانواده‌ی مکمل ساخته می‌شود. طراحیِ هر فیچر مقیدِ اصلِ علّیت است: تمامیِ محاسباتِ غلتان (rolling) صرفاً از داده‌ی تا لحظه‌ی جاری استفاده می‌کنند و هیچ پنجره‌ی مرکزی (centered) یا رو‌به‌جلو به‌کار نمی‌رود — نکته‌ای که در بخشِ ۳-۱۴ اهمیتِ آن با یک آزمایشِ کنترلیِ عمدی نشان داده می‌شود. شکلِ ۹ طبقه‌بندیِ سلسله‌مراتبیِ این چهار خانواده را نشان می‌دهد و جدولِ ۲ آن را با جزئیاتِ بیشتر و نمونه توضیح می‌دهد.</w:t>
+        <w:t xml:space="preserve">برایِ هر نماد، صد فیچرِ عددیِ روزانه از چهار خانواده‌ی مکمل ساخته می‌شود. طراحیِ هر فیچر مقیدِ اصلِ علّیت است: تمامیِ محاسباتِ غلتان (rolling) صرفاً از داده‌ی تا لحظه‌ی جاری استفاده می‌کنند و هیچ پنجره‌ی مرکزی (centered) یا رو‌به‌جلو به‌کار نمی‌رود، نکته‌ای که در بخشِ ۳-۱۴ اهمیتِ آن با یک آزمایشِ کنترلیِ عمدی نشان داده می‌شود. شکلِ ۹ طبقه‌بندیِ سلسله‌مراتبیِ این چهار خانواده را نشان می‌دهد و جدولِ ۲ آن را با جزئیاتِ بیشتر و نمونه توضیح می‌دهد.</w:t>
       </w:r>
     </w:p>
     <w:p>
@@ -2408,7 +2408,7 @@
           <w:szCs w:val="26"/>
           <w:rtl/>
         </w:rPr>
-        <w:t xml:space="preserve">در این بخش، فرمول‌بندیِ دقیقِ مهم‌ترین اندیکاتورهای فنیِ به‌کاررفته در خانواده‌ی فیچرهای پایه و پیشرفته ارائه می‌شود. ارائه‌ی صریحِ این فرمول‌ها — به‌جایِ اکتفا به نامِ اندیکاتور — برای بازتولیدپذیریِ کاملِ پژوهش ضروری است، چرا که بسیاری از این اندیکاتورها (به‌ویژه KAMA و ADX) دارایِ چندین صورت‌بندیِ رایج و کمی متفاوت در کتابخانه‌های مختلف هستند.</w:t>
+        <w:t xml:space="preserve">در این بخش، فرمول‌بندیِ دقیقِ مهم‌ترین اندیکاتورهای فنیِ به‌کاررفته در خانواده‌ی فیچرهای پایه و پیشرفته ارائه می‌شود. ارائه‌ی صریحِ این فرمول‌ها، به‌جایِ اکتفا به نامِ اندیکاتور، برای بازتولیدپذیریِ کاملِ پژوهش ضروری است، چرا که بسیاری از این اندیکاتورها (به‌ویژه KAMA و ADX) دارایِ چندین صورت‌بندیِ رایج و کمی متفاوت در کتابخانه‌های مختلف هستند.</w:t>
       </w:r>
     </w:p>
     <w:p>
@@ -2726,7 +2726,7 @@
           <w:szCs w:val="26"/>
           <w:rtl/>
         </w:rPr>
-        <w:t xml:space="preserve">دامنه‌ی نوسانِ واقعی (ATR) میانگینِ متحرکِ دامنه‌ی روزانه — با احتسابِ شکاف نسبت به قیمتِ پایانیِ روزِ قبل — است و معیارِ استانداردِ نوسان‌پذیریِ مطلق به‌شمار می‌رود:</w:t>
+        <w:t xml:space="preserve">دامنه‌ی نوسانِ واقعی (ATR) میانگینِ متحرکِ دامنه‌ی روزانه، با احتسابِ شکاف نسبت به قیمتِ پایانیِ روزِ قبل، است و معیارِ استانداردِ نوسان‌پذیریِ مطلق به‌شمار می‌رود:</w:t>
       </w:r>
     </w:p>
     <w:p>
@@ -3079,7 +3079,7 @@
           <w:szCs w:val="26"/>
           <w:rtl/>
         </w:rPr>
-        <w:t xml:space="preserve">برخلافِ میانگین‌های متحرکِ ساده که وزنِ ثابت دارند، KAMA سرعتِ خود را بر اساسِ «نسبتِ کارایی» (Efficiency Ratio) — نسبتِ حرکتِ خالص به مجموعِ نوسانات — به‌طور تطبیقی تنظیم می‌کند و در نتیجه در روندهای قوی سریع‌تر و در بازارهای نوسانی کندتر حرکت می‌کند:</w:t>
+        <w:t xml:space="preserve">برخلافِ میانگین‌های متحرکِ ساده که وزنِ ثابت دارند، KAMA سرعتِ خود را بر اساسِ «نسبتِ کارایی» (Efficiency Ratio)، نسبتِ حرکتِ خالص به مجموعِ نوسانات، به‌طور تطبیقی تنظیم می‌کند و در نتیجه در روندهای قوی سریع‌تر و در بازارهای نوسانی کندتر حرکت می‌کند:</w:t>
       </w:r>
     </w:p>
     <w:p>
@@ -3166,7 +3166,7 @@
           <w:szCs w:val="26"/>
           <w:rtl/>
         </w:rPr>
-        <w:t xml:space="preserve">این شاخص، که ریشه در ادبیاتِ اقتصادِ مالی دارد، میانگینِ نسبتِ قدرمطلقِ بازده به ارزشِ معاملات را می‌سنجد و برآوردی از تأثیرِ قیمتیِ هر واحد معامله ارائه می‌دهد — هرچه این مقدار بالاتر باشد، نقدشوندگیِ نماد پایین‌تر است:</w:t>
+        <w:t xml:space="preserve">این شاخص، که ریشه در ادبیاتِ اقتصادِ مالی دارد، میانگینِ نسبتِ قدرمطلقِ بازده به ارزشِ معاملات را می‌سنجد و برآوردی از تأثیرِ قیمتیِ هر واحد معامله ارائه می‌دهد، هرچه این مقدار بالاتر باشد، نقدشوندگیِ نماد پایین‌تر است:</w:t>
       </w:r>
     </w:p>
     <w:p>
@@ -3335,7 +3335,7 @@
           <w:szCs w:val="26"/>
           <w:rtl/>
         </w:rPr>
-        <w:t xml:space="preserve">پیش از ورود به مرحله‌ی مدل‌سازی، مقادیرِ پرتِ هر فیچر با برشِ آماری در بازه‌ی صد انحراف‌معیار از میانه محدود می‌شوند و مقادیرِ گمشده با میانه‌ی همان فیچر (محاسبه‌شده صرفاً روی داده‌ی آموزش، نه کلِ سری) پر می‌شوند. استانداردسازیِ نهاییِ فیچرها با RobustScaler (مبتنی بر میانه و دامنه‌ی میان‌چارکی، نه میانگین و انحراف‌معیار) انجام می‌شود؛ این انتخاب به‌طورِ خاص برایِ داده‌ی مالی مناسب است چرا که در برابرِ دنباله‌های سنگین و مقادیرِ حدیِ ناشی از نوسان‌های شدید، مقاوم‌تر از استانداردسازیِ کلاسیک عمل می‌کند. اسکیلر نیز — همانندِ محاسبه‌ی میانه برایِ پرکردنِ مقادیرِ گمشده — تنها روی بخشِ آموزشِ داده برازش می‌شود تا از نشتِ آماریِ اطلاعاتِ آینده به گذشته جلوگیری شود.</w:t>
+        <w:t xml:space="preserve">پیش از ورود به مرحله‌ی مدل‌سازی، مقادیرِ پرتِ هر فیچر با برشِ آماری در بازه‌ی صد انحراف‌معیار از میانه محدود می‌شوند و مقادیرِ گمشده با میانه‌ی همان فیچر (محاسبه‌شده صرفاً روی داده‌ی آموزش، نه کلِ سری) پر می‌شوند. استانداردسازیِ نهاییِ فیچرها با RobustScaler (مبتنی بر میانه و دامنه‌ی میان‌چارکی، نه میانگین و انحراف‌معیار) انجام می‌شود؛ این انتخاب به‌طورِ خاص برایِ داده‌ی مالی مناسب است چرا که در برابرِ دنباله‌های سنگین و مقادیرِ حدیِ ناشی از نوسان‌های شدید، مقاوم‌تر از استانداردسازیِ کلاسیک عمل می‌کند. اسکیلر نیز، همانندِ محاسبه‌ی میانه برایِ پرکردنِ مقادیرِ گمشده، تنها روی بخشِ آموزشِ داده برازش می‌شود تا از نشتِ آماریِ اطلاعاتِ آینده به گذشته جلوگیری شود.</w:t>
       </w:r>
     </w:p>
     <w:p>
@@ -3554,7 +3554,7 @@
           <w:szCs w:val="26"/>
           <w:rtl/>
         </w:rPr>
-        <w:t xml:space="preserve">در بسیاری از پژوهش‌های مشابه، افقِ پیش‌بینی (و متناظراً، طولِ فرضیِ نگهداریِ آپشن در بک‌تست) یک عددِ ثابت و دلبخواهی — رایج‌ترین آن پنج روزِ معاملاتی، معادلِ یک هفته — برایِ همه‌ی دارایی‌ها در نظر گرفته می‌شود. این پژوهش این فرض را به چالش می‌کشد: نقدشوندگی، دامنه‌ی نوسان و پویاییِ قیمتیِ هر نماد متفاوت است، و افقِ بهینه برایِ کشفِ الگو نیز می‌تواند متفاوت باشد. به‌جای تحمیلِ یک افقِ ثابت، یک </w:t>
+        <w:t xml:space="preserve">در بسیاری از پژوهش‌های مشابه، افقِ پیش‌بینی (و متناظراً، طولِ فرضیِ نگهداریِ آپشن در بک‌تست) یک عددِ ثابت و دلبخواهی، رایج‌ترین آن پنج روزِ معاملاتی، معادلِ یک هفته، برایِ همه‌ی دارایی‌ها در نظر گرفته می‌شود. این پژوهش این فرض را به چالش می‌کشد: نقدشوندگی، دامنه‌ی نوسان و پویاییِ قیمتیِ هر نماد متفاوت است، و افقِ بهینه برایِ کشفِ الگو نیز می‌تواند متفاوت باشد. به‌جای تحمیلِ یک افقِ ثابت، یک </w:t>
       </w:r>
       <w:r>
         <w:rPr>
@@ -3603,7 +3603,7 @@
           <w:szCs w:val="26"/>
           <w:rtl/>
         </w:rPr>
-        <w:t xml:space="preserve">این تورنمنت به‌ازای هر نماد، مجموعه‌ای از افق‌های کاندید (۳، ۵، ۱۰، ۱۵ و ۲۰ روزِ معاملاتی) را با یک مدلِ سبک و ثابت (LightGBM با ابرپارامترهایِ معقولِ ثابت، بدونِ بهینه‌سازیِ ابرپارامتر) روی چند برشِ اعتبارسنجیِ غلتانِ زمانی می‌سنجد و افقِ برنده را صرفاً بر پایه‌ی میانگینِ AUC روی این برش‌های اعتبارسنجی انتخاب می‌کند — هرگز با نگاه به مجموعه‌ی آزمون. این قید حیاتی است: اگر افق بر پایه‌ی عملکرد روی آزمون انتخاب می‌شد، خودِ فرایندِ انتخاب به شکلی از نشتِ اطلاعات (نوعی جست‌وجوی بیش‌برازش‌یافته در فضایِ ابرپارامترها، مشابهِ پدیده‌ی p-hacking در آمار) تبدیل می‌شد. به‌منظورِ شفافیتِ کامل و پیشگیری از هرگونه شائبه‌ی گزینشِ نتیجه‌محور، عملکردِ همه‌ی افق‌های کاندید — نه فقط افقِ برنده — به‌طورِ کامل ثبت و گزارش می‌شود.</w:t>
+        <w:t xml:space="preserve">این تورنمنت به‌ازای هر نماد، مجموعه‌ای از افق‌های کاندید (۳، ۵، ۱۰، ۱۵ و ۲۰ روزِ معاملاتی) را با یک مدلِ سبک و ثابت (LightGBM با ابرپارامترهایِ معقولِ ثابت، بدونِ بهینه‌سازیِ ابرپارامتر) روی چند برشِ اعتبارسنجیِ غلتانِ زمانی می‌سنجد و افقِ برنده را صرفاً بر پایه‌ی میانگینِ AUC روی این برش‌های اعتبارسنجی انتخاب می‌کند، هرگز با نگاه به مجموعه‌ی آزمون. این قید حیاتی است: اگر افق بر پایه‌ی عملکرد روی آزمون انتخاب می‌شد، خودِ فرایندِ انتخاب به شکلی از نشتِ اطلاعات (نوعی جست‌وجوی بیش‌برازش‌یافته در فضایِ ابرپارامترها، مشابهِ پدیده‌ی p-hacking در آمار) تبدیل می‌شد. به‌منظورِ شفافیتِ کامل و پیشگیری از هرگونه شائبه‌ی گزینشِ نتیجه‌محور، عملکردِ همه‌ی افق‌های کاندید، نه فقط افقِ برنده، به‌طورِ کامل ثبت و گزارش می‌شود.</w:t>
       </w:r>
     </w:p>
     <w:p>
@@ -3652,7 +3652,7 @@
           <w:szCs w:val="26"/>
           <w:rtl/>
         </w:rPr>
-        <w:t xml:space="preserve"> واحدِ AUC) از بهترین افق قرار داشته باشند، ساده‌ترین (کوتاه‌ترین) افق در میانِ آن‌ها برگزیده می‌شود — کاربردی از اصلِ ساده‌گراییِ آماری (Parsimony) که ریسکِ برازشِ نویز به‌جای سیگنال را در انتخابِ افق کاهش می‌دهد.</w:t>
+        <w:t xml:space="preserve"> واحدِ AUC) از بهترین افق قرار داشته باشند، ساده‌ترین (کوتاه‌ترین) افق در میانِ آن‌ها برگزیده می‌شود، کاربردی از اصلِ ساده‌گراییِ آماری (Parsimony) که ریسکِ برازشِ نویز به‌جای سیگنال را در انتخابِ افق کاهش می‌دهد.</w:t>
       </w:r>
     </w:p>
     <w:p>
@@ -3673,7 +3673,7 @@
           <w:szCs w:val="26"/>
           <w:rtl/>
         </w:rPr>
-        <w:t xml:space="preserve">افقِ برگزیده‌ی هر نماد، پس از انتخاب، در سراسرِ خط‌لوله به‌طورِ یکدست جاری می‌شود: در فاصله‌ی حذفِ آموزنده‌ی تفکیکِ داده (بخش ۳-۶)، در اعتبارسنجیِ برون‌نمونه‌ایِ یادگیریِ ترکیبی (بخش ۳-۱۰)، در اعتبارسنجیِ غلتانِ زمانی (بخش ۳-۱۱)، در فرضِ طولِ‌عمرِ آپشن برای قیمت‌گذاریِ بلک-شولز (بخش ۳-۱۲)، و در سالانه‌سازیِ معیارهای ریسک و بازده. این یکدستی تضمین می‌کند که فرضِ افق در همه‌جای سامانه هم‌راستا باقی بماند و از بروزِ ناسازگاریِ داخلی — مثلاً استفاده از یک افق برای برچسب و افقِ دیگری برای بلک-شولز — جلوگیری شود.</w:t>
+        <w:t xml:space="preserve">افقِ برگزیده‌ی هر نماد، پس از انتخاب، در سراسرِ خط‌لوله به‌طورِ یکدست جاری می‌شود: در فاصله‌ی حذفِ آموزنده‌ی تفکیکِ داده (بخش ۳-۶)، در اعتبارسنجیِ برون‌نمونه‌ایِ یادگیریِ ترکیبی (بخش ۳-۱۰)، در اعتبارسنجیِ غلتانِ زمانی (بخش ۳-۱۱)، در فرضِ طولِ‌عمرِ آپشن برای قیمت‌گذاریِ بلک-شولز (بخش ۳-۱۲)، و در سالانه‌سازیِ معیارهای ریسک و بازده. این یکدستی تضمین می‌کند که فرضِ افق در همه‌جای سامانه هم‌راستا باقی بماند و از بروزِ ناسازگاریِ داخلی، مثلاً استفاده از یک افق برای برچسب و افقِ دیگری برای بلک-شولز، جلوگیری شود.</w:t>
       </w:r>
     </w:p>
     <w:p>
@@ -3745,7 +3745,7 @@
           <w:szCs w:val="26"/>
           <w:rtl/>
         </w:rPr>
-        <w:t xml:space="preserve"> روزِ آینده نگاه می‌کند، یک تفکیکِ ساده‌ی زمانیِ آموزش/اعتبارسنجی/آزمون (بدونِ تمهیدِ ویژه) در مرزِ هر بخش دچارِ نشتِ اطلاعات می‌شود: چند ردیفِ پایانیِ هر بخش برچسبی دارند که به قیمت‌های درونِ بخشِ بعدی وابسته است. برایِ رفعِ این مشکل — که در ادبیاتِ یادگیریِ ماشینِ مالی (به‌ویژه در آثارِ مارکوس لوپز دو پرادو) با عنوانِ </w:t>
+        <w:t xml:space="preserve"> روزِ آینده نگاه می‌کند، یک تفکیکِ ساده‌ی زمانیِ آموزش/اعتبارسنجی/آزمون (بدونِ تمهیدِ ویژه) در مرزِ هر بخش دچارِ نشتِ اطلاعات می‌شود: چند ردیفِ پایانیِ هر بخش برچسبی دارند که به قیمت‌های درونِ بخشِ بعدی وابسته است. برایِ رفعِ این مشکل، که در ادبیاتِ یادگیریِ ماشینِ مالی (به‌ویژه در آثارِ مارکوس لوپز دو پرادو) با عنوانِ </w:t>
       </w:r>
       <w:r>
         <w:rPr>
@@ -3773,7 +3773,7 @@
           <w:szCs w:val="26"/>
           <w:rtl/>
         </w:rPr>
-        <w:t xml:space="preserve"> شناخته می‌شود — یک فاصله‌ی حذفِ آموزنده به بزرگیِ دقیقاً H ردیف، بینِ انتهایِ هر بخش و ابتدایِ بخشِ بعدی درج می‌شود.</w:t>
+        <w:t xml:space="preserve"> شناخته می‌شود، یک فاصله‌ی حذفِ آموزنده به بزرگیِ دقیقاً H ردیف، بینِ انتهایِ هر بخش و ابتدایِ بخشِ بعدی درج می‌شود.</w:t>
       </w:r>
     </w:p>
     <w:p>
@@ -4031,7 +4031,7 @@
           <w:szCs w:val="26"/>
           <w:rtl/>
         </w:rPr>
-        <w:t xml:space="preserve">لازم به تأکید است که این فاصله‌ی حذفِ آموزنده در تمامِ نقاطی از سامانه که به شکلی مجموعه‌ای از داده را به آموزش و ارزیابی تفکیک می‌کنند — نه فقط در تفکیکِ اولیه — به‌طورِ یکدست اعمال می‌شود؛ این شاملِ اعتبارسنجیِ برون‌نمونه‌ایِ سه‌تاییِ یادگیریِ ترکیبی (بخش ۳-۱۰) و برش‌های اعتبارسنجیِ غلتانِ زمانی (بخش ۳-۱۱) نیز می‌گردد. عدمِ رعایتِ این اصل در هر یک از این نقاط، حتی اگر تفکیکِ اولیه به‌درستی انجام شده باشد، می‌تواند به‌طور غیرمستقیم نشتِ اطلاعات را دوباره وارد کند.</w:t>
+        <w:t xml:space="preserve">لازم به تأکید است که این فاصله‌ی حذفِ آموزنده در تمامِ نقاطی از سامانه که به شکلی مجموعه‌ای از داده را به آموزش و ارزیابی تفکیک می‌کنند، نه فقط در تفکیکِ اولیه، به‌طورِ یکدست اعمال می‌شود؛ این شاملِ اعتبارسنجیِ برون‌نمونه‌ایِ سه‌تاییِ یادگیریِ ترکیبی (بخش ۳-۱۰) و برش‌های اعتبارسنجیِ غلتانِ زمانی (بخش ۳-۱۱) نیز می‌گردد. عدمِ رعایتِ این اصل در هر یک از این نقاط، حتی اگر تفکیکِ اولیه به‌درستی انجام شده باشد، می‌تواند به‌طور غیرمستقیم نشتِ اطلاعات را دوباره وارد کند.</w:t>
       </w:r>
     </w:p>
     <w:p>
@@ -5434,7 +5434,7 @@
           <w:szCs w:val="26"/>
           <w:rtl/>
         </w:rPr>
-        <w:t xml:space="preserve">تمامیِ مدل‌های درختیِ گروهی (ردیف‌های ۱ تا ۴ جدولِ ۳) بر پایه‌ی چارچوبِ کلیِ گرادیان‌بوستینگ یا تجمیعِ بوت‌استرپ (Bagging) ساخته می‌شوند. در گرادیان‌بوستینگ، مدل به‌صورتِ افزایشی و با افزودنِ یک یادگیرندهٔ ضعیفِ جدید در هر گام — که خطای باقی‌ماندهٔ مدلِ فعلی را هدف می‌گیرد — ساخته می‌شود:</w:t>
+        <w:t xml:space="preserve">تمامیِ مدل‌های درختیِ گروهی (ردیف‌های ۱ تا ۴ جدولِ ۳) بر پایه‌ی چارچوبِ کلیِ گرادیان‌بوستینگ یا تجمیعِ بوت‌استرپ (Bagging) ساخته می‌شوند. در گرادیان‌بوستینگ، مدل به‌صورتِ افزایشی و با افزودنِ یک یادگیرندهٔ ضعیفِ جدید در هر گام، که خطای باقی‌ماندهٔ مدلِ فعلی را هدف می‌گیرد، ساخته می‌شود:</w:t>
       </w:r>
     </w:p>
     <w:p>
@@ -5859,7 +5859,7 @@
           <w:szCs w:val="26"/>
           <w:rtl/>
         </w:rPr>
-        <w:t xml:space="preserve">برخلافِ دو مدلِ پیشین که به‌صورتِ متوالی و افزایشی ساخته می‌شوند، جنگلِ تصادفی مجموعه‌ای از درخت‌های تصمیمِ مستقل را به‌صورتِ موازی — هرکدام روی یک نمونه‌ی بوت‌استرپِ متفاوت از داده و یک زیرمجموعه‌ی تصادفی از فیچرها — می‌سازد و خروجیِ نهایی را از میانگین‌گیریِ (Bagging) این درخت‌ها به‌دست می‌آورد. این استقلالِ آماریِ نسبی میانِ درخت‌ها باعث می‌شود جنگلِ تصادفی واریانسِ کمتری نسبت به یک درختِ منفرد داشته باشد، هرچند در ادبیاتِ پیش‌بینیِ مالی معمولاً از دقتِ گرادیان‌بوستینگِ تنظیم‌شده عقب می‌ماند — نکته‌ای که حضورِ آن در تورنمنت به‌عنوانِ یک خطِ مبنایِ (Baseline) قدرتمند اما ساده‌تر توجیه می‌کند.</w:t>
+        <w:t xml:space="preserve">برخلافِ دو مدلِ پیشین که به‌صورتِ متوالی و افزایشی ساخته می‌شوند، جنگلِ تصادفی مجموعه‌ای از درخت‌های تصمیمِ مستقل را به‌صورتِ موازی، هرکدام روی یک نمونه‌ی بوت‌استرپِ متفاوت از داده و یک زیرمجموعه‌ی تصادفی از فیچرها، می‌سازد و خروجیِ نهایی را از میانگین‌گیریِ (Bagging) این درخت‌ها به‌دست می‌آورد. این استقلالِ آماریِ نسبی میانِ درخت‌ها باعث می‌شود جنگلِ تصادفی واریانسِ کمتری نسبت به یک درختِ منفرد داشته باشد، هرچند در ادبیاتِ پیش‌بینیِ مالی معمولاً از دقتِ گرادیان‌بوستینگِ تنظیم‌شده عقب می‌ماند، نکته‌ای که حضورِ آن در تورنمنت به‌عنوانِ یک خطِ مبنایِ (Baseline) قدرتمند اما ساده‌تر توجیه می‌کند.</w:t>
       </w:r>
     </w:p>
     <w:p>
@@ -5900,7 +5900,7 @@
           <w:szCs w:val="26"/>
           <w:rtl/>
         </w:rPr>
-        <w:t xml:space="preserve">CatBoost با معرفیِ بوستینگِ ترتیبی (Ordered Boosting) — که از یک جایگشتِ تصادفیِ داده برای جلوگیری از نشتِ هدف در محاسبه‌ی آماره‌های فیچرهای دسته‌ای استفاده می‌کند — و روشِ اختصاصی برای رمزگذاریِ فیچرهای دسته‌ای، یکی از منابعِ رایجِ بیش‌برازش در گرادیان‌بوستینگِ کلاسیک را برطرف می‌کند. هرچند مجموعه‌ی فیچرهای این پژوهش عمدتاً عددی است (نه دسته‌ای)، مکانیزمِ بوستینگِ ترتیبیِ CatBoost همچنان می‌تواند در برابرِ بیش‌برازشِ ناشی از توالیِ زمانیِ داده مزیت ایجاد کند و از این رو در تورنمنت گنجانده شده است.</w:t>
+        <w:t xml:space="preserve">CatBoost با معرفیِ بوستینگِ ترتیبی (Ordered Boosting)، که از یک جایگشتِ تصادفیِ داده برای جلوگیری از نشتِ هدف در محاسبه‌ی آماره‌های فیچرهای دسته‌ای استفاده می‌کند، و روشِ اختصاصی برای رمزگذاریِ فیچرهای دسته‌ای، یکی از منابعِ رایجِ بیش‌برازش در گرادیان‌بوستینگِ کلاسیک را برطرف می‌کند. هرچند مجموعه‌ی فیچرهای این پژوهش عمدتاً عددی است (نه دسته‌ای)، مکانیزمِ بوستینگِ ترتیبیِ CatBoost همچنان می‌تواند در برابرِ بیش‌برازشِ ناشی از توالیِ زمانیِ داده مزیت ایجاد کند و از این رو در تورنمنت گنجانده شده است.</w:t>
       </w:r>
     </w:p>
     <w:p>
@@ -5985,7 +5985,7 @@
           <w:szCs w:val="26"/>
           <w:rtl/>
         </w:rPr>
-        <w:t xml:space="preserve">دو مدلِ آخرِ تورنمنت — LSTM با مکانیزمِ توجه و CNN-LSTM — تنها مدل‌هایی هستند که به‌طورِ صریح توالیِ زمانی را می‌بینند، نه فقط مقدارِ فیچرها در یک روزِ منفرد. این تمایز از نظرِ نظری اهمیت دارد: مدل‌های درختی و MLP هر ردیف را با فرضِ استقلالِ آماری از ردیف‌های مجاور پردازش می‌کنند، در حالی‌که رفتارِ بازار اغلب دارایِ وابستگیِ سریالی (Serial Dependence) در نوسان‌پذیری و مومنتوم است — پدیده‌ای که در ادبیاتِ اقتصادسنجیِ مالی با عنوانِ خوشه‌بندیِ نوسان (Volatility Clustering) شناخته می‌شود.</w:t>
+        <w:t xml:space="preserve">دو مدلِ آخرِ تورنمنت، LSTM با مکانیزمِ توجه و CNN-LSTM، تنها مدل‌هایی هستند که به‌طورِ صریح توالیِ زمانی را می‌بینند، نه فقط مقدارِ فیچرها در یک روزِ منفرد. این تمایز از نظرِ نظری اهمیت دارد: مدل‌های درختی و MLP هر ردیف را با فرضِ استقلالِ آماری از ردیف‌های مجاور پردازش می‌کنند، در حالی‌که رفتارِ بازار اغلب دارایِ وابستگیِ سریالی (Serial Dependence) در نوسان‌پذیری و مومنتوم است، پدیده‌ای که در ادبیاتِ اقتصادسنجیِ مالی با عنوانِ خوشه‌بندیِ نوسان (Volatility Clustering) شناخته می‌شود.</w:t>
       </w:r>
     </w:p>
     <w:p>
@@ -6075,7 +6075,7 @@
           <w:szCs w:val="26"/>
           <w:rtl/>
         </w:rPr>
-        <w:t xml:space="preserve">معادلاتِ به‌روزرسانیِ استانداردِ یک سلولِ LSTM به‌صورتِ زیر است — با دروازه‌های فراموشی (f)، ورودی (i) و خروجی (o)، و حالتِ سلولیِ c:</w:t>
+        <w:t xml:space="preserve">معادلاتِ به‌روزرسانیِ استانداردِ یک سلولِ LSTM به‌صورتِ زیر است، با دروازه‌های فراموشی (f)، ورودی (i) و خروجی (o)، و حالتِ سلولیِ c:</w:t>
       </w:r>
     </w:p>
     <w:p>
@@ -6463,7 +6463,7 @@
           <w:szCs w:val="26"/>
           <w:rtl/>
         </w:rPr>
-        <w:t xml:space="preserve"> استفاده می‌کند — نه یک برشِ داخلیِ کوچک از داده‌ی آموزش — تا معیارِ توقف با معیارِ ارزیابیِ سایرِ مدل‌ها کاملاً هم‌راستا بماند. هنگامی که این مدل بعداً بدونِ دسترسی به مجموعه‌ی اعتبارسنجیِ واقعی (مثلاً درونِ فرایندِ اعتبارسنجیِ غلتانِ زمانی) بازآموزی می‌شود، به‌طورِ خودکار به یک برشِ داخلیِ پانزده‌درصدی از انتهایِ داده‌ی آموزش برایِ توقفِ زودهنگام سقوط می‌کند — رفتاری که سازگاریِ کاملِ مدل با هر دو سناریوی «دسترسی به Val واقعی» و «عدمِ دسترسی» را تضمین می‌کند.</w:t>
+        <w:t xml:space="preserve"> استفاده می‌کند، نه یک برشِ داخلیِ کوچک از داده‌ی آموزش، تا معیارِ توقف با معیارِ ارزیابیِ سایرِ مدل‌ها کاملاً هم‌راستا بماند. هنگامی که این مدل بعداً بدونِ دسترسی به مجموعه‌ی اعتبارسنجیِ واقعی (مثلاً درونِ فرایندِ اعتبارسنجیِ غلتانِ زمانی) بازآموزی می‌شود، به‌طورِ خودکار به یک برشِ داخلیِ پانزده‌درصدی از انتهایِ داده‌ی آموزش برایِ توقفِ زودهنگام سقوط می‌کند، رفتاری که سازگاریِ کاملِ مدل با هر دو سناریوی «دسترسی به Val واقعی» و «عدمِ دسترسی» را تضمین می‌کند.</w:t>
       </w:r>
     </w:p>
     <w:p>
@@ -6648,7 +6648,7 @@
           <w:szCs w:val="26"/>
           <w:rtl/>
         </w:rPr>
-        <w:t xml:space="preserve"> است: از آن‌جا که کلِ پنجره‌ی ورودی از پیش متعلق به گذشته است (بدونِ نگاه به روزهای پس از لحظه‌ی تصمیم)، اعمالِ کانولوشن روی این پنجره به‌خودیِ‌خود هیچ نشتِ اطلاعاتی ایجاد نمی‌کند. از نظرِ مهندسیِ نرم‌افزار، این معماری با گسترشِ همان کلاسِ LSTM موجود (نه ایجادِ یک کلاسِ کاملاً جدید) پیاده‌سازی شده — با افزودنِ یک پرچمِ فعال/غیرفعال — تا منطقِ پنجره‌بندی، توقفِ زودهنگام و سازگاریِ با sklearn بدونِ بازنویسی به ارث برسد. شکلِ ۴ معماریِ کاملِ این مدل را نشان می‌دهد.</w:t>
+        <w:t xml:space="preserve"> است: از آن‌جا که کلِ پنجره‌ی ورودی از پیش متعلق به گذشته است (بدونِ نگاه به روزهای پس از لحظه‌ی تصمیم)، اعمالِ کانولوشن روی این پنجره به‌خودیِ‌خود هیچ نشتِ اطلاعاتی ایجاد نمی‌کند. از نظرِ مهندسیِ نرم‌افزار، این معماری با گسترشِ همان کلاسِ LSTM موجود (نه ایجادِ یک کلاسِ کاملاً جدید) پیاده‌سازی شده، با افزودنِ یک پرچمِ فعال/غیرفعال، تا منطقِ پنجره‌بندی، توقفِ زودهنگام و سازگاریِ با sklearn بدونِ بازنویسی به ارث برسد. شکلِ ۴ معماریِ کاملِ این مدل را نشان می‌دهد.</w:t>
       </w:r>
     </w:p>
     <w:p>
@@ -6777,7 +6777,7 @@
           <w:szCs w:val="26"/>
           <w:rtl/>
         </w:rPr>
-        <w:t xml:space="preserve">تنظیمِ ابرپارامترِ هر یک از هفت مدلِ منفرد با چارچوبِ Optuna و نمونه‌گیرِ درختِ ساختاریِ پارزن (Tree-structured Parzen Estimator، یا TPE) انجام می‌شود. برخلافِ جست‌وجویِ شبکه‌ای که فضایِ ابرپارامتر را به‌طورِ یکنواخت و کور می‌کاود، TPE یک مدلِ احتمالاتیِ جانشین (Surrogate Model) از توزیعِ ابرپارامترهایِ «خوب» در برابرِ «بد» می‌سازد و در هر تکرار، ناحیه‌ای از فضا را نمونه‌گیری می‌کند که بیشترین بهبودِ موردانتظار را نوید می‌دهد؛ این رویکرد نسبت به جست‌وجویِ شبکه‌ای یا تصادفیِ ساده، با تعدادِ آزمایشِ کمتر به نواحیِ امیدبخش‌ترِ فضایِ ابرپارامتر همگرا می‌شود — مزیتی که با توجه به هزینه‌ی محاسباتیِ بالایِ آموزشِ مدل‌های عصبی، اهمیتِ عملیِ ویژه‌ای دارد.</w:t>
+        <w:t xml:space="preserve">تنظیمِ ابرپارامترِ هر یک از هفت مدلِ منفرد با چارچوبِ Optuna و نمونه‌گیرِ درختِ ساختاریِ پارزن (Tree-structured Parzen Estimator، یا TPE) انجام می‌شود. برخلافِ جست‌وجویِ شبکه‌ای که فضایِ ابرپارامتر را به‌طورِ یکنواخت و کور می‌کاود، TPE یک مدلِ احتمالاتیِ جانشین (Surrogate Model) از توزیعِ ابرپارامترهایِ «خوب» در برابرِ «بد» می‌سازد و در هر تکرار، ناحیه‌ای از فضا را نمونه‌گیری می‌کند که بیشترین بهبودِ موردانتظار را نوید می‌دهد؛ این رویکرد نسبت به جست‌وجویِ شبکه‌ای یا تصادفیِ ساده، با تعدادِ آزمایشِ کمتر به نواحیِ امیدبخش‌ترِ فضایِ ابرپارامتر همگرا می‌شود، مزیتی که با توجه به هزینه‌ی محاسباتیِ بالایِ آموزشِ مدل‌های عصبی، اهمیتِ عملیِ ویژه‌ای دارد.</w:t>
       </w:r>
     </w:p>
     <w:p>
@@ -6798,7 +6798,7 @@
           <w:szCs w:val="26"/>
           <w:rtl/>
         </w:rPr>
-        <w:t xml:space="preserve">بذرِ تصادفی (Random Seed) در سراسرِ سامانه — شاملِ نمونه‌گیرِ Optuna — ثابت نگه داشته می‌شود تا بازتولیدپذیریِ کامل تضمین گردد. تعدادِ آزمایش‌هایِ اختصاص‌یافته به هر مدل (جدولِ ۳) متناسب با هزینه‌ی محاسباتیِ هر fit تعیین شده است: مدل‌های عصبی که هر fit در آن‌ها چندین ده epoch به‌طول می‌انجامد، سهمِ کمتری از تعدادِ آزمایش می‌گیرند تا زمانِ کلِ اجرایِ تورنمنت در محدوده‌ی منطقی باقی بماند.</w:t>
+        <w:t xml:space="preserve">بذرِ تصادفی (Random Seed) در سراسرِ سامانه، شاملِ نمونه‌گیرِ Optuna، ثابت نگه داشته می‌شود تا بازتولیدپذیریِ کامل تضمین گردد. تعدادِ آزمایش‌هایِ اختصاص‌یافته به هر مدل (جدولِ ۳) متناسب با هزینه‌ی محاسباتیِ هر fit تعیین شده است: مدل‌های عصبی که هر fit در آن‌ها چندین ده epoch به‌طول می‌انجامد، سهمِ کمتری از تعدادِ آزمایش می‌گیرند تا زمانِ کلِ اجرایِ تورنمنت در محدوده‌ی منطقی باقی بماند.</w:t>
       </w:r>
     </w:p>
     <w:p>
@@ -6990,7 +6990,7 @@
           <w:szCs w:val="26"/>
           <w:rtl/>
         </w:rPr>
-        <w:t xml:space="preserve"> نیمه‌عمرِ وزن‌دهی — معادلِ حدوداً دو سالِ معاملاتی — است؛ آخرین ردیف وزنِ کاملِ یک می‌گیرد و ردیف‌های قدیمی‌تر با افتِ نمایی وزن می‌گیرند. شکلِ ۸ این منحنیِ افتِ نمایی را به‌طورِ گرافیکی نشان می‌دهد.</w:t>
+        <w:t xml:space="preserve"> نیمه‌عمرِ وزن‌دهی، معادلِ حدوداً دو سالِ معاملاتی، است؛ آخرین ردیف وزنِ کاملِ یک می‌گیرد و ردیف‌های قدیمی‌تر با افتِ نمایی وزن می‌گیرند. شکلِ ۸ این منحنیِ افتِ نمایی را به‌طورِ گرافیکی نشان می‌دهد.</w:t>
       </w:r>
     </w:p>
     <w:p>
@@ -7234,7 +7234,7 @@
           <w:szCs w:val="26"/>
           <w:rtl/>
         </w:rPr>
-        <w:t xml:space="preserve">، یک مدلِ فرا (Meta-Learner) از نوعِ رگرسیونِ لجستیک را روی خروجیِ احتمالاتیِ پنج مدلِ پایه آموزش می‌دهد؛ برایِ جلوگیری از بیش‌برازشِ مدلِ فرا، این خروجی‌ها با روشِ خارج‌از‌نمونه‌ی سه‌تایی (۳-fold Out-Of-Fold) — که خود نیز مقیدِ همان فاصله‌ی حذفِ آموزنده‌ی بخشِ ۳-۶ است — تولید می‌شوند، نه با پیش‌بینیِ مستقیمِ روی همان داده‌ای که مدل‌های پایه رویش آموزش دیده‌اند. رویکردِ دوم، </w:t>
+        <w:t xml:space="preserve">، یک مدلِ فرا (Meta-Learner) از نوعِ رگرسیونِ لجستیک را روی خروجیِ احتمالاتیِ پنج مدلِ پایه آموزش می‌دهد؛ برایِ جلوگیری از بیش‌برازشِ مدلِ فرا، این خروجی‌ها با روشِ خارج‌از‌نمونه‌ی سه‌تایی (۳-fold Out-Of-Fold)، که خود نیز مقیدِ همان فاصله‌ی حذفِ آموزنده‌ی بخشِ ۳-۶ است، تولید می‌شوند، نه با پیش‌بینیِ مستقیمِ روی همان داده‌ای که مدل‌های پایه رویش آموزش دیده‌اند. رویکردِ دوم، </w:t>
       </w:r>
       <w:r>
         <w:rPr>
@@ -7283,7 +7283,7 @@
           <w:szCs w:val="26"/>
           <w:rtl/>
         </w:rPr>
-        <w:t xml:space="preserve">در نهایت، برایِ هر نماد، مدلِ برنده — که می‌تواند یک مدلِ منفرد یا یکی از این دو رویکردِ ترکیبی باشد — بر اساسِ AUC روی مجموعه‌ی اعتبارسنجی انتخاب می‌شود. این انتخاب سپس در معرضِ آزمونِ استحکامِ بخشِ ۳-۱۱ قرار می‌گیرد و در صورتِ ناپایداری، به یک ترکیبِ محافظه‌کارانه‌ترِ میانگینِ رتبه‌ای سقوط می‌کند. علاوه بر میانگینِ ساده‌ی احتمالات، سامانه امکانِ میانگین‌گیریِ بیزیِ وزن‌دار (Bayesian Model Averaging) را نیز فراهم می‌کند که در آن وزنِ هر مدل متناسب با توانِ چهارمِ AUCِ اعتبارسنجیِ آن (پس از کسرِ سطحِ تصادفی) تعیین می‌شود؛ این وزن‌دهیِ غیرخطی باعث می‌شود مدل‌هایی که تنها اندکی بهتر از تصادف عمل کرده‌اند عملاً از میانگین‌گیری حذف شوند.</w:t>
+        <w:t xml:space="preserve">در نهایت، برایِ هر نماد، مدلِ برنده، که می‌تواند یک مدلِ منفرد یا یکی از این دو رویکردِ ترکیبی باشد، بر اساسِ AUC روی مجموعه‌ی اعتبارسنجی انتخاب می‌شود. این انتخاب سپس در معرضِ آزمونِ استحکامِ بخشِ ۳-۱۱ قرار می‌گیرد و در صورتِ ناپایداری، به یک ترکیبِ محافظه‌کارانه‌ترِ میانگینِ رتبه‌ای سقوط می‌کند. علاوه بر میانگینِ ساده‌ی احتمالات، سامانه امکانِ میانگین‌گیریِ بیزیِ وزن‌دار (Bayesian Model Averaging) را نیز فراهم می‌کند که در آن وزنِ هر مدل متناسب با توانِ چهارمِ AUCِ اعتبارسنجیِ آن (پس از کسرِ سطحِ تصادفی) تعیین می‌شود؛ این وزن‌دهیِ غیرخطی باعث می‌شود مدل‌هایی که تنها اندکی بهتر از تصادف عمل کرده‌اند عملاً از میانگین‌گیری حذف شوند.</w:t>
       </w:r>
     </w:p>
     <w:p>
@@ -7327,7 +7327,7 @@
           <w:szCs w:val="26"/>
           <w:rtl/>
         </w:rPr>
-        <w:t xml:space="preserve">یک تفکیکِ ثابتِ آموزش/اعتبارسنجی/آزمون — هرچند با فاصله‌ی حذفِ آموزنده‌ی صحیح (بخش ۳-۶) — تنها یک نمونه از عملکردِ ممکنِ مدل را نشان می‌دهد. عملکردِ برتر روی این یک تفکیکِ خاص می‌تواند محصولِ شانس یا بیش‌برازش به همان برشِ خاص باشد، نه مهارتِ واقعیِ پایدار. برایِ رفعِ این نگرانی، معماریِ برنده‌ی هر نماد — با همان ابرپارامترهایی که تورنمنتِ اصلی یافته، بدونِ تنظیمِ دوباره — روی سه برشِ غلتانِ زمانیِ دیگر دوباره برازش و ارزیابی می‌شود.</w:t>
+        <w:t xml:space="preserve">یک تفکیکِ ثابتِ آموزش/اعتبارسنجی/آزمون، هرچند با فاصله‌ی حذفِ آموزنده‌ی صحیح (بخش ۳-۶)، تنها یک نمونه از عملکردِ ممکنِ مدل را نشان می‌دهد. عملکردِ برتر روی این یک تفکیکِ خاص می‌تواند محصولِ شانس یا بیش‌برازش به همان برشِ خاص باشد، نه مهارتِ واقعیِ پایدار. برایِ رفعِ این نگرانی، معماریِ برنده‌ی هر نماد، با همان ابرپارامترهایی که تورنمنتِ اصلی یافته، بدونِ تنظیمِ دوباره، روی سه برشِ غلتانِ زمانیِ دیگر دوباره برازش و ارزیابی می‌شود.</w:t>
       </w:r>
     </w:p>
     <w:p>
@@ -7376,7 +7376,7 @@
           <w:szCs w:val="26"/>
           <w:rtl/>
         </w:rPr>
-        <w:t xml:space="preserve"> با پارامترِ سه فولد استفاده می‌شود که در آن، برخلافِ اعتبارسنجیِ متقاطعِ استانداردِ k-fold (که فرضِ تبادل‌پذیریِ ردیف‌ها را دارد و برایِ داده‌ی سری‌زمانی نامعتبر است)، هر فولد تنها روی داده‌ای که از نظرِ زمانی پیش از آن قرار دارد آموزش می‌بیند و آزمایش می‌کند — یعنی مرزهای هر فولد به‌ترتیبِ زمانی جلو می‌روند، نه به‌طورِ تصادفی جابه‌جا می‌شوند. برایِ هر فولد نیز، همانندِ تفکیکِ اصلیِ بخشِ ۳-۶، فاصله‌ی حذفِ آموزنده‌ای برابر با H از انتهایِ بخشِ آموزشِ آن فولد کنار گذاشته می‌شود.</w:t>
+        <w:t xml:space="preserve"> با پارامترِ سه فولد استفاده می‌شود که در آن، برخلافِ اعتبارسنجیِ متقاطعِ استانداردِ k-fold (که فرضِ تبادل‌پذیریِ ردیف‌ها را دارد و برایِ داده‌ی سری‌زمانی نامعتبر است)، هر فولد تنها روی داده‌ای که از نظرِ زمانی پیش از آن قرار دارد آموزش می‌بیند و آزمایش می‌کند، یعنی مرزهای هر فولد به‌ترتیبِ زمانی جلو می‌روند، نه به‌طورِ تصادفی جابه‌جا می‌شوند. برایِ هر فولد نیز، همانندِ تفکیکِ اصلیِ بخشِ ۳-۶، فاصله‌ی حذفِ آموزنده‌ای برابر با H از انتهایِ بخشِ آموزشِ آن فولد کنار گذاشته می‌شود.</w:t>
       </w:r>
     </w:p>
     <w:p>
@@ -7490,7 +7490,7 @@
           <w:szCs w:val="26"/>
           <w:rtl/>
         </w:rPr>
-        <w:t xml:space="preserve"> فراتر رود، انتخابِ اصلیِ سامانه دست‌نخورده باقی می‌ماند. اما اگر میانگین زیرِ این آستانه بیفتد — نشانه‌ای از اینکه مدلِ برنده به‌احتمالِ زیاد به تفکیکِ خاصِ اعتبارسنجی بیش‌برازش شده — سامانه به‌طورِ </w:t>
+        <w:t xml:space="preserve"> فراتر رود، انتخابِ اصلیِ سامانه دست‌نخورده باقی می‌ماند. اما اگر میانگین زیرِ این آستانه بیفتد، نشانه‌ای از اینکه مدلِ برنده به‌احتمالِ زیاد به تفکیکِ خاصِ اعتبارسنجی بیش‌برازش شده، سامانه به‌طورِ </w:t>
       </w:r>
       <w:r>
         <w:rPr>
@@ -7583,7 +7583,7 @@
           <w:szCs w:val="26"/>
           <w:rtl/>
         </w:rPr>
-        <w:t xml:space="preserve">خروجیِ احتمالاتیِ سامانه (بخش‌های ۳-۷ تا ۳-۱۱) ورودیِ یک موتورِ بک‌تست است که استراتژیِ اختیارِ خریدِ پوشش‌داده‌شده را شبیه‌سازی می‌کند. طراحیِ این موتور از یک اصلِ بنیادین پیروی می‌کند که آن را از بسیاری از مطالعاتِ مشابه متمایز می‌سازد: پوزیسیونِ سهامِ پایه همواره و به‌طورِ کامل (صد درصد) حفظ می‌شود — دقیقاً همان‌طور که صندوق‌های واقعیِ Covered-Call (مانندِ QYLD یا JEPI در بازارهای توسعه‌یافته) عمل می‌کنند — و تنها تصمیمی که مدل اتخاذ می‌کند، «فروش یا عدم‌فروشِ اختیارِ خرید» و «وزنِ این فروش» است، نه اندازه‌ی پوزیسیونِ سهام. این طراحی از یک اشکالِ رایج پیشگیری می‌کند: اگر اندازه‌ی پوزیسیون با اطمینانِ مدل کوچک و بزرگ شود، مقایسه با راهبردِ خرید-و-نگهداریِ ساده (Buy &amp; Hold) که همواره صد درصد در بازار است، از پایه ناعادلانه خواهد بود.</w:t>
+        <w:t xml:space="preserve">خروجیِ احتمالاتیِ سامانه (بخش‌های ۳-۷ تا ۳-۱۱) ورودیِ یک موتورِ بک‌تست است که استراتژیِ اختیارِ خریدِ پوشش‌داده‌شده را شبیه‌سازی می‌کند. طراحیِ این موتور از یک اصلِ بنیادین پیروی می‌کند که آن را از بسیاری از مطالعاتِ مشابه متمایز می‌سازد: پوزیسیونِ سهامِ پایه همواره و به‌طورِ کامل (صد درصد) حفظ می‌شود، دقیقاً همان‌طور که صندوق‌های واقعیِ Covered-Call (مانندِ QYLD یا JEPI در بازارهای توسعه‌یافته) عمل می‌کنند، و تنها تصمیمی که مدل اتخاذ می‌کند، «فروش یا عدم‌فروشِ اختیارِ خرید» و «وزنِ این فروش» است، نه اندازه‌ی پوزیسیونِ سهام. این طراحی از یک اشکالِ رایج پیشگیری می‌کند: اگر اندازه‌ی پوزیسیون با اطمینانِ مدل کوچک و بزرگ شود، مقایسه با راهبردِ خرید-و-نگهداریِ ساده (Buy &amp; Hold) که همواره صد درصد در بازار است، از پایه ناعادلانه خواهد بود.</w:t>
       </w:r>
     </w:p>
     <w:p>
@@ -7859,7 +7859,7 @@
           <w:szCs w:val="26"/>
           <w:rtl/>
         </w:rPr>
-        <w:t xml:space="preserve"> تابعِ توزیعِ تجمعیِ نرمالِ استاندارد است. اگر پرمیومِ فرضیِ بازار کمتر از این پرمیومِ منصفانه باشد، فروشِ اختیارِ خرید در آن روز غیرِفعال می‌ماند — یک </w:t>
+        <w:t xml:space="preserve"> تابعِ توزیعِ تجمعیِ نرمالِ استاندارد است. اگر پرمیومِ فرضیِ بازار کمتر از این پرمیومِ منصفانه باشد، فروشِ اختیارِ خرید در آن روز غیرِفعال می‌ماند، یک </w:t>
       </w:r>
       <w:r>
         <w:rPr>
@@ -7936,7 +7936,7 @@
           <w:szCs w:val="26"/>
           <w:rtl/>
         </w:rPr>
-        <w:t xml:space="preserve"> نیز پیاده‌سازی شده است: هنگامی که سیگنالِ روندِ صعودیِ قوی (بر پایه‌ی همگراییِ میانگین‌های متحرک و مومنتومِ چند-بازه‌ای، هر دو محاسبه‌شده صرفاً از داده‌ی تا لحظه‌ی جاری) فعال باشد، فروشِ اختیارِ خرید به‌طورِ کامل متوقف می‌شود تا سقفِ سود در بحبوحه‌ی یک رالیِ قوی از دست نرود — رفتاری که دسک‌های واقعیِ Buy-Write نیز در عمل به‌کار می‌گیرند. هیچ‌یک از این دو دروازه به قیمت‌های آینده یا برچسبِ هدف نگاه نمی‌کنند؛ تنها منطقِ خودِ استراتژی، نه منطقِ مدل، واقع‌بینانه‌تر شده است.</w:t>
+        <w:t xml:space="preserve"> نیز پیاده‌سازی شده است: هنگامی که سیگنالِ روندِ صعودیِ قوی (بر پایه‌ی همگراییِ میانگین‌های متحرک و مومنتومِ چند-بازه‌ای، هر دو محاسبه‌شده صرفاً از داده‌ی تا لحظه‌ی جاری) فعال باشد، فروشِ اختیارِ خرید به‌طورِ کامل متوقف می‌شود تا سقفِ سود در بحبوحه‌ی یک رالیِ قوی از دست نرود، رفتاری که دسک‌های واقعیِ Buy-Write نیز در عمل به‌کار می‌گیرند. هیچ‌یک از این دو دروازه به قیمت‌های آینده یا برچسبِ هدف نگاه نمی‌کنند؛ تنها منطقِ خودِ استراتژی، نه منطقِ مدل، واقع‌بینانه‌تر شده است.</w:t>
       </w:r>
     </w:p>
     <w:p>
@@ -7977,7 +7977,7 @@
           <w:szCs w:val="26"/>
           <w:rtl/>
         </w:rPr>
-        <w:t xml:space="preserve">شکلِ ۷ منطقِ کاملِ تصمیم‌گیریِ روزانه‌ی موتورِ بک‌تست را — از بررسیِ دروازه‌ی روند تا انتخابِ میانِ چهار وضعیتِ ممکن (بدونِ فروشِ کال به‌دلیلِ روند، بدونِ فروش به‌دلیلِ پرمیومِ ناعادلانه، فروشِ کاملِ کال، یا فروشِ جزئی) — به‌صورتِ یک فلوچارت نشان می‌دهد.</w:t>
+        <w:t xml:space="preserve">شکلِ ۷ منطقِ کاملِ تصمیم‌گیریِ روزانه‌ی موتورِ بک‌تست را، از بررسیِ دروازه‌ی روند تا انتخابِ میانِ چهار وضعیتِ ممکن (بدونِ فروشِ کال به‌دلیلِ روند، بدونِ فروش به‌دلیلِ پرمیومِ ناعادلانه، فروشِ کاملِ کال، یا فروشِ جزئی)، به‌صورتِ یک فلوچارت نشان می‌دهد.</w:t>
       </w:r>
     </w:p>
     <w:p>
@@ -8147,7 +8147,7 @@
           <w:szCs w:val="26"/>
           <w:rtl/>
         </w:rPr>
-        <w:t xml:space="preserve"> نیز — همانندِ آستانه‌ی طبقه‌بندیِ دودویی — صرفاً از توزیعِ احتمالاتِ مجموعه‌ی اعتبارسنجی (نه آزمون) استخراج می‌شوند.</w:t>
+        <w:t xml:space="preserve"> نیز، همانندِ آستانه‌ی طبقه‌بندیِ دودویی، صرفاً از توزیعِ احتمالاتِ مجموعه‌ی اعتبارسنجی (نه آزمون) استخراج می‌شوند.</w:t>
       </w:r>
     </w:p>
     <w:p>
@@ -8255,7 +8255,7 @@
           <w:szCs w:val="26"/>
           <w:rtl/>
         </w:rPr>
-        <w:t xml:space="preserve">نسبتِ سورتینو، نسخه‌ی اصلاح‌شده‌ی نسبتِ شارپ است که تنها نوسان‌پذیریِ سمتِ نزولی (نه کلِ نوسان‌پذیری) را در مخرج قرار می‌دهد — معیاری که برایِ استراتژی‌هایِ نامتقارن مانندِ Covered-Call (که سقفِ سودِ محدود ولی کفِ زیانِ نامحدود دارد) مناسب‌تر است:</w:t>
+        <w:t xml:space="preserve">نسبتِ سورتینو، نسخه‌ی اصلاح‌شده‌ی نسبتِ شارپ است که تنها نوسان‌پذیریِ سمتِ نزولی (نه کلِ نوسان‌پذیری) را در مخرج قرار می‌دهد، معیاری که برایِ استراتژی‌هایِ نامتقارن مانندِ Covered-Call (که سقفِ سودِ محدود ولی کفِ زیانِ نامحدود دارد) مناسب‌تر است:</w:t>
       </w:r>
     </w:p>
     <w:p>
@@ -8751,7 +8751,7 @@
           <w:szCs w:val="26"/>
           <w:rtl/>
         </w:rPr>
-        <w:t xml:space="preserve">در کنارِ معیارهای مالیِ بخشِ ۳-۱۲-۳، عملکردِ خودِ مدل‌های طبقه‌بندی (پیش از تبدیل به تصمیمِ معاملاتی) نیز با مجموعه‌ای استانداردِ معیارهای یادگیریِ ماشین سنجیده می‌شود. AUC-ROC — معیارِ اصلیِ رتبه‌بندیِ مدل‌ها در سراسرِ این فصل — مساحتِ زیرِ منحنیِ مشخصه‌ی عملکردِ گیرنده را می‌سنجد و به‌طورِ شهودی، احتمالِ آن است که مدل به یک نمونه‌ی مثبتِ تصادفی، امتیازِ بالاتری نسبت به یک نمونه‌ی منفیِ تصادفی بدهد. مزیتِ کلیدیِ AUC نسبت به دقتِ خام (Accuracy) این است که مستقل از انتخابِ آستانه‌ی تصمیم است و در نتیجه، رتبه‌بندیِ مدل‌ها را در مرحله‌ی تورنمنت (که هنوز آستانه‌ی نهایی انتخاب نشده) امکان‌پذیر می‌سازد.</w:t>
+        <w:t xml:space="preserve">در کنارِ معیارهای مالیِ بخشِ ۳-۱۲-۳، عملکردِ خودِ مدل‌های طبقه‌بندی (پیش از تبدیل به تصمیمِ معاملاتی) نیز با مجموعه‌ای استانداردِ معیارهای یادگیریِ ماشین سنجیده می‌شود. AUC-ROC، معیارِ اصلیِ رتبه‌بندیِ مدل‌ها در سراسرِ این فصل، مساحتِ زیرِ منحنیِ مشخصه‌ی عملکردِ گیرنده را می‌سنجد و به‌طورِ شهودی، احتمالِ آن است که مدل به یک نمونه‌ی مثبتِ تصادفی، امتیازِ بالاتری نسبت به یک نمونه‌ی منفیِ تصادفی بدهد. مزیتِ کلیدیِ AUC نسبت به دقتِ خام (Accuracy) این است که مستقل از انتخابِ آستانه‌ی تصمیم است و در نتیجه، رتبه‌بندیِ مدل‌ها را در مرحله‌ی تورنمنت (که هنوز آستانه‌ی نهایی انتخاب نشده) امکان‌پذیر می‌سازد.</w:t>
       </w:r>
     </w:p>
     <w:p>
@@ -8839,7 +8839,7 @@
           <w:szCs w:val="26"/>
           <w:rtl/>
         </w:rPr>
-        <w:t xml:space="preserve">در نهایت، برایِ سنجشِ کیفیتِ کالیبراسیونِ خروجیِ احتمالاتی (نه فقط رتبه‌بندیِ آن)، از نمره‌ی برایر (Brier Score) — میانگینِ مربعِ خطای احتمالِ پیش‌بینی‌شده نسبت به برچسبِ واقعی — استفاده می‌شود؛ مقدارِ کمتر نشان‌دهنده‌ی کالیبراسیونِ بهتر است:</w:t>
+        <w:t xml:space="preserve">در نهایت، برایِ سنجشِ کیفیتِ کالیبراسیونِ خروجیِ احتمالاتی (نه فقط رتبه‌بندیِ آن)، از نمره‌ی برایر (Brier Score)، میانگینِ مربعِ خطای احتمالِ پیش‌بینی‌شده نسبت به برچسبِ واقعی، استفاده می‌شود؛ مقدارِ کمتر نشان‌دهنده‌ی کالیبراسیونِ بهتر است:</w:t>
       </w:r>
     </w:p>
     <w:p>
@@ -8906,7 +8906,7 @@
           <w:szCs w:val="26"/>
           <w:rtl/>
         </w:rPr>
-        <w:t xml:space="preserve">این معیار به‌ویژه پس از اعمالِ کالیبراسیونِ ایزوتونیک (که در بخشِ ۳-۱۰ به‌اختصار اشاره شد) اهمیت می‌یابد، چرا که هدفِ کالیبراسیون دقیقاً کاهشِ همین معیار است — یعنی نزدیک‌ترکردنِ احتمالاتِ خروجیِ مدل به فراوانی‌های واقعیِ رخداد، نه صرفاً بهبودِ توانِ رتبه‌بندی.</w:t>
+        <w:t xml:space="preserve">این معیار به‌ویژه پس از اعمالِ کالیبراسیونِ ایزوتونیک (که در بخشِ ۳-۱۰ به‌اختصار اشاره شد) اهمیت می‌یابد، چرا که هدفِ کالیبراسیون دقیقاً کاهشِ همین معیار است، یعنی نزدیک‌ترکردنِ احتمالاتِ خروجیِ مدل به فراوانی‌های واقعیِ رخداد، نه صرفاً بهبودِ توانِ رتبه‌بندی.</w:t>
       </w:r>
     </w:p>
     <w:p>
@@ -8950,7 +8950,7 @@
           <w:szCs w:val="26"/>
           <w:rtl/>
         </w:rPr>
-        <w:t xml:space="preserve">در کنارِ خط‌لوله‌یِ اصلی — که در این فصل با عنوانِ </w:t>
+        <w:t xml:space="preserve">در کنارِ خط‌لوله‌یِ اصلی، که در این فصل با عنوانِ </w:t>
       </w:r>
       <w:r>
         <w:rPr>
@@ -8978,7 +8978,7 @@
           <w:szCs w:val="26"/>
           <w:rtl/>
         </w:rPr>
-        <w:t xml:space="preserve"> شناخته می‌شود — یک مسیرِ کنترلیِ کاملاً موازی نیز پیاده‌سازی شده است تا تأثیرِ کمّیِ نشتِ اطلاعات را به‌طورِ عینی نشان دهد. این مسیرِ کنترلی با افزودنِ </w:t>
+        <w:t xml:space="preserve"> شناخته می‌شود، یک مسیرِ کنترلیِ کاملاً موازی نیز پیاده‌سازی شده است تا تأثیرِ کمّیِ نشتِ اطلاعات را به‌طورِ عینی نشان دهد. این مسیرِ کنترلی با افزودنِ </w:t>
       </w:r>
       <w:r>
         <w:rPr>
@@ -9034,7 +9034,7 @@
           <w:szCs w:val="26"/>
           <w:rtl/>
         </w:rPr>
-        <w:t xml:space="preserve"> t نیز استفاده می‌کند — یعنی مستقیماً اطلاعاتِ آینده را نشت می‌دهد.</w:t>
+        <w:t xml:space="preserve"> t نیز استفاده می‌کند، یعنی مستقیماً اطلاعاتِ آینده را نشت می‌دهد.</w:t>
       </w:r>
     </w:p>
     <w:p>
@@ -9055,7 +9055,7 @@
           <w:szCs w:val="26"/>
           <w:rtl/>
         </w:rPr>
-        <w:t xml:space="preserve">این مسیرِ کنترلی از یک زیرمجموعه‌ی محدودترِ پنج مدل (LightGBM، XGBoost، Random Forest، و دو رویکردِ ترکیبیِ متناظر — بدونِ CatBoost، MLP، LSTM یا CNN-LSTM) استفاده می‌کند تا حتی با مجموعه‌ای ضعیف‌تر از مدل‌ها، تأثیرِ خودِ نشتِ اطلاعات به‌وضوح قابلِ مشاهده باشد. تمامیِ مراحلِ پایین‌دستی — تورنمنت، یادگیریِ ترکیبی، تحلیلِ اهمیتِ فیچر و بک‌تست — به‌طورِ کامل برایِ این مسیرِ کنترلی نیز تکرار می‌شوند تا امکانِ مقایسه‌ی مستقیم و سلول‌به‌سلول با مسیرِ HONEST فراهم شود.</w:t>
+        <w:t xml:space="preserve">این مسیرِ کنترلی از یک زیرمجموعه‌ی محدودترِ پنج مدل (LightGBM، XGBoost، Random Forest، و دو رویکردِ ترکیبیِ متناظر، بدونِ CatBoost، MLP، LSTM یا CNN-LSTM) استفاده می‌کند تا حتی با مجموعه‌ای ضعیف‌تر از مدل‌ها، تأثیرِ خودِ نشتِ اطلاعات به‌وضوح قابلِ مشاهده باشد. تمامیِ مراحلِ پایین‌دستی، تورنمنت، یادگیریِ ترکیبی، تحلیلِ اهمیتِ فیچر و بک‌تست، به‌طورِ کامل برایِ این مسیرِ کنترلی نیز تکرار می‌شوند تا امکانِ مقایسه‌ی مستقیم و سلول‌به‌سلول با مسیرِ HONEST فراهم شود.</w:t>
       </w:r>
     </w:p>
     <w:p>
@@ -9104,7 +9104,7 @@
           <w:szCs w:val="26"/>
           <w:rtl/>
         </w:rPr>
-        <w:t xml:space="preserve"> منبعِ گزارشِ رسمی یا مبنایِ هیچ تصمیمِ سرمایه‌گذاری نیست؛ کارکردِ آن صرفاً آموزشی و کنترلی است — نمایشِ اینکه معیارهایِ عملکردِ به‌ظاهر برتر (نظیرِ AUC بالاتر) می‌توانند به‌سادگی محصولِ یک باگِ ظریفِ مهندسیِ فیچر باشند، نه مهارتِ واقعیِ مدل. جزئیاتِ کمّیِ این مقایسه، همانندِ سایرِ نتایج، در فصلِ نتایج ارائه خواهد شد.</w:t>
+        <w:t xml:space="preserve"> منبعِ گزارشِ رسمی یا مبنایِ هیچ تصمیمِ سرمایه‌گذاری نیست؛ کارکردِ آن صرفاً آموزشی و کنترلی است، نمایشِ اینکه معیارهایِ عملکردِ به‌ظاهر برتر (نظیرِ AUC بالاتر) می‌توانند به‌سادگی محصولِ یک باگِ ظریفِ مهندسیِ فیچر باشند، نه مهارتِ واقعیِ مدل. جزئیاتِ کمّیِ این مقایسه، همانندِ سایرِ نتایج، در فصلِ نتایج ارائه خواهد شد.</w:t>
       </w:r>
     </w:p>
     <w:p>
@@ -9209,7 +9209,7 @@
           <w:szCs w:val="26"/>
           <w:rtl/>
         </w:rPr>
-        <w:t xml:space="preserve">یک بذرِ تصادفیِ سراسری در ابتدایِ اجرا تنظیم و به تمامیِ منابعِ تصادفی‌بودن — کتابخانه‌ی استانداردِ پایتون، NumPy، نمونه‌گیرِ Optuna، و مقداردهیِ اولیه‌ی وزن‌های شبکه‌های عصبی در PyTorch — منتقل می‌شود. این تضمین می‌کند که اجرای مجددِ کاملِ سامانه، با فرضِ ثابت‌ماندنِ نسخه‌های کتابخانه‌ها، به نتایجِ یکسان منجر شود؛ ویژگی‌ای که برایِ داوریِ علمی و بازبینیِ مستقل ضروری است.</w:t>
+        <w:t xml:space="preserve">یک بذرِ تصادفیِ سراسری در ابتدایِ اجرا تنظیم و به تمامیِ منابعِ تصادفی‌بودن، کتابخانه‌ی استانداردِ پایتون، NumPy، نمونه‌گیرِ Optuna، و مقداردهیِ اولیه‌ی وزن‌های شبکه‌های عصبی در PyTorch، منتقل می‌شود. این تضمین می‌کند که اجرای مجددِ کاملِ سامانه، با فرضِ ثابت‌ماندنِ نسخه‌های کتابخانه‌ها، به نتایجِ یکسان منجر شود؛ ویژگی‌ای که برایِ داوریِ علمی و بازبینیِ مستقل ضروری است.</w:t>
       </w:r>
     </w:p>
     <w:p>
@@ -9250,7 +9250,7 @@
           <w:szCs w:val="26"/>
           <w:rtl/>
         </w:rPr>
-        <w:t xml:space="preserve">با توجه به اینکه اجرایِ کاملِ تورنمنتِ نُه‌مدلی برایِ شش نماد — به‌دلیلِ حجمِ بالایِ آزمایش‌های بهینه‌سازیِ ابرپارامتر (جدولِ ۳) — می‌تواند ساعت‌ها به طول بینجامد، یک مکانیزمِ نقطه‌ی بازرسی (Checkpointing) روی دیسک پیاده‌سازی شده است: بلافاصله پس از پایانِ تورنمنتِ هر نماد، مدل‌های آموزش‌دیده و معیارهایِ اعتبارسنجیِ آن به‌طورِ کامل ذخیره می‌شوند. اگر اجرا به هر دلیلی (مثلاً قطعیِ زیرساختِ محاسباتی) میانِ‌راه متوقف شود، اجرایِ بعدی نمادهایِ از‌پیش‌تکمیل‌شده را از دیسک بازیابی می‌کند و تنها نمادهایِ باقی‌مانده را آموزش می‌دهد — بدونِ نیاز به بازآموزیِ کامل از ابتدا. اعتبارِ هر نقطه‌ی بازرسی با تطبیقِ افقِ ذخیره‌شده و مجموعه‌ی دقیقِ مدل‌ها بررسی می‌شود تا از استفاده‌ی نابجای یک نقطه‌ی بازرسیِ متعلق به نسخه‌ای دیگر از کد جلوگیری شود. این مکانیزم صرفاً یک تمهیدِ مهندسیِ زیرساختی برای افزایشِ کارایی و تاب‌آوریِ اجراست و هیچ تأثیری بر نتایجِ نهایی یا روش‌شناسیِ آماریِ سامانه ندارد.</w:t>
+        <w:t xml:space="preserve">با توجه به اینکه اجرایِ کاملِ تورنمنتِ نُه‌مدلی برایِ شش نماد، به‌دلیلِ حجمِ بالایِ آزمایش‌های بهینه‌سازیِ ابرپارامتر (جدولِ ۳)، می‌تواند ساعت‌ها به طول بینجامد، یک مکانیزمِ نقطه‌ی بازرسی (Checkpointing) روی دیسک پیاده‌سازی شده است: بلافاصله پس از پایانِ تورنمنتِ هر نماد، مدل‌های آموزش‌دیده و معیارهایِ اعتبارسنجیِ آن به‌طورِ کامل ذخیره می‌شوند. اگر اجرا به هر دلیلی (مثلاً قطعیِ زیرساختِ محاسباتی) میانِ‌راه متوقف شود، اجرایِ بعدی نمادهایِ از‌پیش‌تکمیل‌شده را از دیسک بازیابی می‌کند و تنها نمادهایِ باقی‌مانده را آموزش می‌دهد، بدونِ نیاز به بازآموزیِ کامل از ابتدا. اعتبارِ هر نقطه‌ی بازرسی با تطبیقِ افقِ ذخیره‌شده و مجموعه‌ی دقیقِ مدل‌ها بررسی می‌شود تا از استفاده‌ی نابجای یک نقطه‌ی بازرسیِ متعلق به نسخه‌ای دیگر از کد جلوگیری شود. این مکانیزم صرفاً یک تمهیدِ مهندسیِ زیرساختی برای افزایشِ کارایی و تاب‌آوریِ اجراست و هیچ تأثیری بر نتایجِ نهایی یا روش‌شناسیِ آماریِ سامانه ندارد.</w:t>
       </w:r>
     </w:p>
     <w:p>
@@ -9294,7 +9294,7 @@
           <w:szCs w:val="26"/>
           <w:rtl/>
         </w:rPr>
-        <w:t xml:space="preserve">در این فصل، معماریِ کاملِ سامانه‌ی پیشنهادی — از دریافتِ داده‌ی خامِ قیمتی تا بهینه‌سازیِ نهاییِ پرتفوی — به‌همراهِ فرمول‌بندیِ کاملِ ریاضیِ هر جزء، به‌تفصیل شرح داده شد. سامانه بر پایه‌ی سه اصلِ راهنما ساخته شده: علّیتِ سخت‌گیرانه در تمامیِ محاسبات، اعتبارسنجیِ چندلایه (شاملِ تفکیکِ زمانیِ حذف‌شده و اعتبارسنجیِ غلتانِ زمانی)، و صداقتِ روش‌شناختی (از طریقِ مقایسه‌ی صریح با یک مسیرِ کنترلیِ دارایِ نشتِ اطلاعات). نوآوری‌های اصلیِ این رویکرد نسبت به رویه‌های رایج عبارت‌اند از: تورنمنتِ انتخابِ افقِ پیش‌بینیِ اختصاصیِ هر نماد به‌جایِ یک افقِ ثابتِ دلبخواهی، افزودنِ یک مکانیزمِ خودکارِ ایمنی‌سازیِ انتخاب که خروجیِ اعتبارسنجیِ غلتانِ زمانی را واقعاً در گزارشِ نهایی اثر می‌دهد (نه صرفاً به‌عنوانِ ابزاری تشخیصیِ بدونِ پیامد)، بهره‌گیری از یک فیچرِ کلانِ اقتصادیِ برون‌زا در کنارِ فیچرهایِ مبتنی بر خودِ قیمت، طراحیِ یک موتورِ بک‌تست که پوزیسیونِ سهام را به‌طورِ کامل حفظ می‌کند تا مقایسه با راهبردِ خرید-و-نگهداری از پایه منصفانه بماند، و در نهایت یک زیرساختِ اجراییِ تاب‌آور در برابرِ وقفه که کاراییِ عملیِ اجرایِ تجربی را بدونِ کوچک‌ترین اثری بر روش‌شناسیِ آماری بهبود می‌دهد. فصلِ بعد، نتایجِ حاصل از اجرایِ کاملِ این سامانه را — به‌همراهِ تحلیلِ صادقانه‌ی هم دستاوردها و هم محدودیت‌ها — ارائه خواهد داد.</w:t>
+        <w:t xml:space="preserve">در این فصل، معماریِ کاملِ سامانه‌ی پیشنهادی، از دریافتِ داده‌ی خامِ قیمتی تا بهینه‌سازیِ نهاییِ پرتفوی، به‌همراهِ فرمول‌بندیِ کاملِ ریاضیِ هر جزء، به‌تفصیل شرح داده شد. سامانه بر پایه‌ی سه اصلِ راهنما ساخته شده: علّیتِ سخت‌گیرانه در تمامیِ محاسبات، اعتبارسنجیِ چندلایه (شاملِ تفکیکِ زمانیِ حذف‌شده و اعتبارسنجیِ غلتانِ زمانی)، و صداقتِ روش‌شناختی (از طریقِ مقایسه‌ی صریح با یک مسیرِ کنترلیِ دارایِ نشتِ اطلاعات). نوآوری‌های اصلیِ این رویکرد نسبت به رویه‌های رایج عبارت‌اند از: تورنمنتِ انتخابِ افقِ پیش‌بینیِ اختصاصیِ هر نماد به‌جایِ یک افقِ ثابتِ دلبخواهی، افزودنِ یک مکانیزمِ خودکارِ ایمنی‌سازیِ انتخاب که خروجیِ اعتبارسنجیِ غلتانِ زمانی را واقعاً در گزارشِ نهایی اثر می‌دهد (نه صرفاً به‌عنوانِ ابزاری تشخیصیِ بدونِ پیامد)، بهره‌گیری از یک فیچرِ کلانِ اقتصادیِ برون‌زا در کنارِ فیچرهایِ مبتنی بر خودِ قیمت، طراحیِ یک موتورِ بک‌تست که پوزیسیونِ سهام را به‌طورِ کامل حفظ می‌کند تا مقایسه با راهبردِ خرید-و-نگهداری از پایه منصفانه بماند، و در نهایت یک زیرساختِ اجراییِ تاب‌آور در برابرِ وقفه که کاراییِ عملیِ اجرایِ تجربی را بدونِ کوچک‌ترین اثری بر روش‌شناسیِ آماری بهبود می‌دهد. فصلِ بعد، نتایجِ حاصل از اجرایِ کاملِ این سامانه را، به‌همراهِ تحلیلِ صادقانه‌ی هم دستاوردها و هم محدودیت‌ها، ارائه خواهد داد.</w:t>
       </w:r>
     </w:p>
     <w:sectPr>

</xml_diff>